<commit_message>
docs: borrador del Diario de Reflexión 2.1 (Fase 2)
</commit_message>
<xml_diff>
--- a/docs/fase2/evidencias_individuales/VERGARA_ANDRES_2.1_APT122_DiarioReflexionFase2.docx
+++ b/docs/fase2/evidencias_individuales/VERGARA_ANDRES_2.1_APT122_DiarioReflexionFase2.docx
@@ -299,7 +299,7 @@
           <w:tcPr>
             <w:tcW w:w="10076" w:type="dxa"/>
             <w:shd w:val="clear" w:color="auto" w:fill="DEEAF6" w:themeFill="accent1" w:themeFillTint="33"/>
-            <w:vAlign w:val="center"/>
+            <w:vAlign w:val="top"/>
           </w:tcPr>
           <w:p>
             <w:pPr>
@@ -322,47 +322,42 @@
           </w:p>
           <w:p>
             <w:pPr>
+              <w:spacing w:before="120" w:after="120"/>
               <w:jc w:val="both"/>
+            </w:pPr>
+            <w:r>
               <w:rPr>
-                <w:rFonts w:eastAsiaTheme="majorEastAsia"/>
-                <w:color w:val="767171" w:themeColor="background2" w:themeShade="80"/>
-                <w:sz w:val="24"/>
-                <w:szCs w:val="24"/>
+                <w:color w:val="262626"/>
+                <w:sz w:val="22"/>
               </w:rPr>
-            </w:pPr>
+              <w:t>No todas las actividades se cumplieron en los tiempos definidos. De acuerdo con la carta Gantt, las actividades de la Fase 1 (Sprints 1 y 2) y el Sprint 3 (captura y detección, OE1) se completaron: simulador de 8 sensores, reglas de umbral, API FastAPI y persistencia local. En el Sprint 4 avancé la mayor parte de lo planificado: sincronización con Supabase mediante triggers, panel del cuidador en React desplegado en Vercel, alertas por WebSocket y ntfy, seudonimización del RUT con SHA-256 y RLS, y los endpoints HL7 FHIR Observation, que adelanté porque estaban previstos para después del prototipo. También dejé una réplica del sistema con Docker Compose en AWS EC2 como entorno experimental.</w:t>
+            </w:r>
           </w:p>
           <w:p>
             <w:pPr>
+              <w:spacing w:before="0" w:after="120"/>
               <w:jc w:val="both"/>
+            </w:pPr>
+            <w:r>
               <w:rPr>
-                <w:rFonts w:ascii="Calibri" w:hAnsi="Calibri"/>
-                <w:b/>
-                <w:bCs/>
-                <w:color w:val="1F4E79" w:themeColor="accent1" w:themeShade="80"/>
+                <w:color w:val="262626"/>
+                <w:sz w:val="22"/>
               </w:rPr>
-            </w:pPr>
+              <w:t>Quedaron pendientes el conteo de entregas de ntfy, la prueba de continuidad sin conexión, la autenticación de la API, el recurso FHIR Patient y el despliegue en Oracle Cloud Santiago.</w:t>
+            </w:r>
           </w:p>
           <w:p>
             <w:pPr>
+              <w:spacing w:before="0" w:after="120"/>
               <w:jc w:val="both"/>
+            </w:pPr>
+            <w:r>
               <w:rPr>
-                <w:rFonts w:ascii="Calibri" w:hAnsi="Calibri"/>
-                <w:b/>
-                <w:bCs/>
-                <w:color w:val="1F4E79" w:themeColor="accent1" w:themeShade="80"/>
+                <w:color w:val="262626"/>
+                <w:sz w:val="22"/>
               </w:rPr>
-            </w:pPr>
-          </w:p>
-          <w:p>
-            <w:pPr>
-              <w:jc w:val="both"/>
-              <w:rPr>
-                <w:rFonts w:ascii="Calibri" w:hAnsi="Calibri"/>
-                <w:b/>
-                <w:bCs/>
-                <w:color w:val="1F4E79" w:themeColor="accent1" w:themeShade="80"/>
-              </w:rPr>
-            </w:pPr>
+              <w:t>Entre los factores que facilitaron el trabajo destaco los planes gratuitos de Render, Vercel y Supabase, la arquitectura modular, mi formación previa en informática biomédica y la retroalimentación del docente. Las principales dificultades fueron técnicas (la pausa automática de Supabase por inactividad, la latencia de Render por la distancia geográfica, la configuración de notificaciones en Android y el registro en Oracle) y de tiempo, porque trabajo en turnos rotativos 7x7, lo que me obliga a concentrar el avance del proyecto en mis días libres.</w:t>
+            </w:r>
           </w:p>
         </w:tc>
       </w:tr>
@@ -435,7 +430,7 @@
           <w:tcPr>
             <w:tcW w:w="10076" w:type="dxa"/>
             <w:shd w:val="clear" w:color="auto" w:fill="DEEAF6" w:themeFill="accent1" w:themeFillTint="33"/>
-            <w:vAlign w:val="center"/>
+            <w:vAlign w:val="top"/>
           </w:tcPr>
           <w:p>
             <w:pPr>
@@ -458,47 +453,42 @@
           </w:p>
           <w:p>
             <w:pPr>
+              <w:spacing w:before="120" w:after="120"/>
               <w:jc w:val="both"/>
+            </w:pPr>
+            <w:r>
               <w:rPr>
-                <w:rFonts w:ascii="Calibri" w:hAnsi="Calibri"/>
-                <w:b/>
-                <w:bCs/>
-                <w:color w:val="1F4E79" w:themeColor="accent1" w:themeShade="80"/>
+                <w:color w:val="262626"/>
+                <w:sz w:val="22"/>
               </w:rPr>
-            </w:pPr>
+              <w:t>He enfrentado las dificultades priorizando siempre el flujo crítico del proyecto: caída, detección, alerta y cuidador. Cuando algo fallaba, primero aseguraba que ese flujo siguiera funcionando y después resolvía el resto.</w:t>
+            </w:r>
           </w:p>
           <w:p>
             <w:pPr>
+              <w:spacing w:before="0" w:after="120"/>
               <w:jc w:val="both"/>
+            </w:pPr>
+            <w:r>
               <w:rPr>
-                <w:rFonts w:ascii="Calibri" w:hAnsi="Calibri"/>
-                <w:b/>
-                <w:bCs/>
-                <w:color w:val="1F4E79" w:themeColor="accent1" w:themeShade="80"/>
+                <w:color w:val="262626"/>
+                <w:sz w:val="22"/>
               </w:rPr>
-            </w:pPr>
+              <w:t>Cada problema lo registré como hallazgo o ajuste en el registro de pruebas, con su causa y su solución. Por ejemplo, la pausa de Supabase la resolví reactivando el proyecto y documentando el procedimiento; la latencia de Render la medí y la comparé con AWS (de cerca de 1,6 s a 216 ms), lo que me permitió identificar la distancia como un factor relevante; y en Android ajusté la entrega instantánea y el ahorro de batería para que llegaran las notificaciones.</w:t>
+            </w:r>
           </w:p>
           <w:p>
             <w:pPr>
+              <w:spacing w:before="0" w:after="120"/>
               <w:jc w:val="both"/>
+            </w:pPr>
+            <w:r>
               <w:rPr>
-                <w:rFonts w:ascii="Calibri" w:hAnsi="Calibri"/>
-                <w:b/>
-                <w:bCs/>
-                <w:color w:val="1F4E79" w:themeColor="accent1" w:themeShade="80"/>
+                <w:color w:val="262626"/>
+                <w:sz w:val="22"/>
               </w:rPr>
-            </w:pPr>
-          </w:p>
-          <w:p>
-            <w:pPr>
-              <w:jc w:val="both"/>
-              <w:rPr>
-                <w:rFonts w:ascii="Calibri" w:hAnsi="Calibri"/>
-                <w:b/>
-                <w:bCs/>
-                <w:color w:val="1F4E79" w:themeColor="accent1" w:themeShade="80"/>
-              </w:rPr>
-            </w:pPr>
+              <w:t>Para el problema de tiempo, organizo el trabajo en bloques de pocas horas con una lista de tareas por bloque, y hago commit al final de cada uno para no perder avances. Además, envío avances al docente por correo cuando no puedo asistir a clases. Para lo que viene, planeo desplegar en Oracle Cloud Santiago para reducir la latencia y ejecutar las pruebas pendientes antes de la segunda evaluación de la Fase 2.</w:t>
+            </w:r>
           </w:p>
         </w:tc>
       </w:tr>
@@ -667,7 +657,7 @@
           <w:tcPr>
             <w:tcW w:w="10076" w:type="dxa"/>
             <w:shd w:val="clear" w:color="auto" w:fill="DEEAF6" w:themeFill="accent1" w:themeFillTint="33"/>
-            <w:vAlign w:val="center"/>
+            <w:vAlign w:val="top"/>
           </w:tcPr>
           <w:p>
             <w:pPr>
@@ -723,47 +713,29 @@
           </w:p>
           <w:p>
             <w:pPr>
+              <w:spacing w:before="120" w:after="120"/>
               <w:jc w:val="both"/>
+            </w:pPr>
+            <w:r>
               <w:rPr>
-                <w:rFonts w:ascii="Calibri" w:hAnsi="Calibri"/>
-                <w:b/>
-                <w:bCs/>
-                <w:color w:val="1F4E79" w:themeColor="accent1" w:themeShade="80"/>
+                <w:color w:val="262626"/>
+                <w:sz w:val="22"/>
               </w:rPr>
-            </w:pPr>
+              <w:t>Evalúo mi trabajo de forma positiva, aunque con aspectos por mejorar. Destaco que el prototipo funciona de extremo a extremo y está desplegado en la nube, que las evidencias son reales (capturas, scripts de prueba, mediciones de latencia y un Bundle FHIR validado) y que documenté con honestidad tanto lo logrado como lo pendiente.</w:t>
+            </w:r>
           </w:p>
           <w:p>
             <w:pPr>
+              <w:spacing w:before="0" w:after="120"/>
               <w:jc w:val="both"/>
+            </w:pPr>
+            <w:r>
               <w:rPr>
-                <w:rFonts w:ascii="Calibri" w:hAnsi="Calibri"/>
-                <w:b/>
-                <w:bCs/>
-                <w:color w:val="1F4E79" w:themeColor="accent1" w:themeShade="80"/>
+                <w:color w:val="262626"/>
+                <w:sz w:val="22"/>
               </w:rPr>
-            </w:pPr>
-          </w:p>
-          <w:p>
-            <w:pPr>
-              <w:jc w:val="both"/>
-              <w:rPr>
-                <w:rFonts w:ascii="Calibri" w:hAnsi="Calibri"/>
-                <w:b/>
-                <w:bCs/>
-                <w:color w:val="1F4E79" w:themeColor="accent1" w:themeShade="80"/>
-              </w:rPr>
-            </w:pPr>
-          </w:p>
-          <w:p>
-            <w:pPr>
-              <w:jc w:val="both"/>
-              <w:rPr>
-                <w:rFonts w:ascii="Calibri" w:hAnsi="Calibri"/>
-                <w:b/>
-                <w:bCs/>
-                <w:color w:val="1F4E79" w:themeColor="accent1" w:themeShade="80"/>
-              </w:rPr>
-            </w:pPr>
+              <w:t>Para mejorar, debo ejecutar las pruebas antes y no dejarlas para el final, estimar mejor el tiempo de las tareas técnicas que dependen de servicios externos y cuidar el alcance: adelantar FHIR fue útil, pero retrasó otras pruebas que también eran importantes. También quiero hacer commits más pequeños y frecuentes para que el historial del repositorio refleje mejor el avance.</w:t>
+            </w:r>
           </w:p>
         </w:tc>
       </w:tr>
@@ -837,7 +809,7 @@
           <w:tcPr>
             <w:tcW w:w="10076" w:type="dxa"/>
             <w:shd w:val="clear" w:color="auto" w:fill="DEEAF6" w:themeFill="accent1" w:themeFillTint="33"/>
-            <w:vAlign w:val="center"/>
+            <w:vAlign w:val="top"/>
           </w:tcPr>
           <w:p>
             <w:pPr>
@@ -860,58 +832,55 @@
           </w:p>
           <w:p>
             <w:pPr>
+              <w:spacing w:before="120" w:after="120"/>
               <w:jc w:val="both"/>
+            </w:pPr>
+            <w:r>
               <w:rPr>
-                <w:rFonts w:ascii="Calibri" w:hAnsi="Calibri"/>
-                <w:b/>
-                <w:bCs/>
-                <w:color w:val="1F4E79" w:themeColor="accent1" w:themeShade="80"/>
+                <w:color w:val="262626"/>
+                <w:sz w:val="22"/>
               </w:rPr>
-            </w:pPr>
+              <w:t>Me quedan algunas inquietudes sobre el alcance de la segunda evaluación de la Fase 2. Las preguntas que me gustaría hacerle al docente son:</w:t>
+            </w:r>
           </w:p>
           <w:p>
             <w:pPr>
+              <w:spacing w:before="0" w:after="120"/>
               <w:jc w:val="both"/>
+            </w:pPr>
+            <w:r>
               <w:rPr>
-                <w:rFonts w:ascii="Calibri" w:hAnsi="Calibri"/>
-                <w:b/>
-                <w:bCs/>
-                <w:color w:val="1F4E79" w:themeColor="accent1" w:themeShade="80"/>
+                <w:color w:val="262626"/>
+                <w:sz w:val="22"/>
               </w:rPr>
-            </w:pPr>
+              <w:t>1. Si no se aprueba a tiempo mi cuenta de Oracle Cloud, ¿es suficiente presentar la comparación de latencia entre Render y AWS EC2, o se espera necesariamente el despliegue en Santiago?</w:t>
+            </w:r>
           </w:p>
           <w:p>
             <w:pPr>
+              <w:spacing w:before="0" w:after="120"/>
               <w:jc w:val="both"/>
+            </w:pPr>
+            <w:r>
               <w:rPr>
-                <w:rFonts w:ascii="Calibri" w:hAnsi="Calibri"/>
-                <w:b/>
-                <w:bCs/>
-                <w:color w:val="1F4E79" w:themeColor="accent1" w:themeShade="80"/>
+                <w:color w:val="262626"/>
+                <w:sz w:val="22"/>
               </w:rPr>
-            </w:pPr>
+              <w:t>2. Para la interoperabilidad, ¿basta con los recursos FHIR Observation y Patient en el prototipo, o se espera algún recurso adicional?</w:t>
+            </w:r>
           </w:p>
           <w:p>
             <w:pPr>
+              <w:spacing w:before="0" w:after="120"/>
               <w:jc w:val="both"/>
+            </w:pPr>
+            <w:r>
               <w:rPr>
-                <w:rFonts w:ascii="Calibri" w:hAnsi="Calibri"/>
-                <w:b/>
-                <w:bCs/>
-                <w:color w:val="1F4E79" w:themeColor="accent1" w:themeShade="80"/>
+                <w:color w:val="262626"/>
+                <w:sz w:val="22"/>
               </w:rPr>
-            </w:pPr>
-          </w:p>
-          <w:p>
-            <w:pPr>
-              <w:jc w:val="both"/>
-              <w:rPr>
-                <w:rFonts w:ascii="Calibri" w:hAnsi="Calibri"/>
-                <w:b/>
-                <w:bCs/>
-                <w:color w:val="1F4E79" w:themeColor="accent1" w:themeShade="80"/>
-              </w:rPr>
-            </w:pPr>
+              <w:t>3. Para la prueba de usabilidad con la escala SUS de la Fase 3, ¿cuántos participantes se consideran suficientes para un prototipo académico?</w:t>
+            </w:r>
           </w:p>
         </w:tc>
       </w:tr>
@@ -996,7 +965,7 @@
           <w:tcPr>
             <w:tcW w:w="10076" w:type="dxa"/>
             <w:shd w:val="clear" w:color="auto" w:fill="DEEAF6" w:themeFill="accent1" w:themeFillTint="33"/>
-            <w:vAlign w:val="center"/>
+            <w:vAlign w:val="top"/>
           </w:tcPr>
           <w:p>
             <w:pPr>
@@ -1019,47 +988,29 @@
           </w:p>
           <w:p>
             <w:pPr>
+              <w:spacing w:before="120" w:after="120"/>
               <w:jc w:val="both"/>
+            </w:pPr>
+            <w:r>
               <w:rPr>
-                <w:rFonts w:eastAsiaTheme="majorEastAsia"/>
-                <w:color w:val="767171" w:themeColor="background2" w:themeShade="80"/>
-                <w:sz w:val="24"/>
-                <w:szCs w:val="24"/>
+                <w:color w:val="262626"/>
+                <w:sz w:val="22"/>
               </w:rPr>
-            </w:pPr>
+              <w:t>Mi proyecto se desarrolla en modalidad individual, por lo que no hay actividades que redistribuir entre miembros de un grupo. Aplico Scrum individual y asumo los roles de Product Owner, Scrum Master y equipo de desarrollo.</w:t>
+            </w:r>
           </w:p>
           <w:p>
             <w:pPr>
+              <w:spacing w:before="0" w:after="120"/>
               <w:jc w:val="both"/>
+            </w:pPr>
+            <w:r>
               <w:rPr>
-                <w:rFonts w:eastAsiaTheme="majorEastAsia"/>
-                <w:color w:val="767171" w:themeColor="background2" w:themeShade="80"/>
-                <w:sz w:val="24"/>
-                <w:szCs w:val="24"/>
+                <w:color w:val="262626"/>
+                <w:sz w:val="22"/>
               </w:rPr>
-            </w:pPr>
-          </w:p>
-          <w:p>
-            <w:pPr>
-              <w:jc w:val="both"/>
-              <w:rPr>
-                <w:rFonts w:eastAsiaTheme="majorEastAsia"/>
-                <w:color w:val="767171" w:themeColor="background2" w:themeShade="80"/>
-                <w:sz w:val="24"/>
-                <w:szCs w:val="24"/>
-              </w:rPr>
-            </w:pPr>
-          </w:p>
-          <w:p>
-            <w:pPr>
-              <w:jc w:val="both"/>
-              <w:rPr>
-                <w:rFonts w:ascii="Calibri" w:hAnsi="Calibri"/>
-                <w:b/>
-                <w:bCs/>
-                <w:color w:val="1F4E79" w:themeColor="accent1" w:themeShade="80"/>
-              </w:rPr>
-            </w:pPr>
+              <w:t>Sí hay nuevas actividades que incorporé al Product Backlog a partir de este monitoreo: el conteo de entregas de ntfy con 30 caídas, la prueba de continuidad sin conexión, la autenticación de la API (PS-01), el recurso FHIR Patient, el despliegue en Oracle Cloud Santiago y algunos ajustes del panel (estados simulados de Raspberry y MQTT, estilo de alertas atendidas y la regla de apertura de puerta). Las ordené por prioridad para abordarlas antes de la segunda evaluación.</w:t>
+            </w:r>
           </w:p>
         </w:tc>
       </w:tr>
@@ -1154,7 +1105,7 @@
           <w:tcPr>
             <w:tcW w:w="10076" w:type="dxa"/>
             <w:shd w:val="clear" w:color="auto" w:fill="DEEAF6" w:themeFill="accent1" w:themeFillTint="33"/>
-            <w:vAlign w:val="center"/>
+            <w:vAlign w:val="top"/>
           </w:tcPr>
           <w:p>
             <w:pPr>
@@ -1177,58 +1128,29 @@
           </w:p>
           <w:p>
             <w:pPr>
+              <w:spacing w:before="120" w:after="120"/>
               <w:jc w:val="both"/>
+            </w:pPr>
+            <w:r>
               <w:rPr>
-                <w:rFonts w:eastAsiaTheme="majorEastAsia"/>
-                <w:color w:val="767171" w:themeColor="background2" w:themeShade="80"/>
-                <w:sz w:val="24"/>
-                <w:szCs w:val="24"/>
+                <w:color w:val="262626"/>
+                <w:sz w:val="22"/>
               </w:rPr>
-            </w:pPr>
+              <w:t>Al ser un proyecto individual, no hay trabajo en grupo propiamente tal. Lo más cercano ha sido la colaboración con el docente, cuya retroalimentación por correo me ha ayudado a corregir el rumbo y a ajustar la redacción de los informes para que reflejen con precisión lo que está implementado.</w:t>
+            </w:r>
           </w:p>
           <w:p>
             <w:pPr>
+              <w:spacing w:before="0" w:after="120"/>
               <w:jc w:val="both"/>
+            </w:pPr>
+            <w:r>
               <w:rPr>
-                <w:rFonts w:eastAsiaTheme="majorEastAsia"/>
-                <w:color w:val="767171" w:themeColor="background2" w:themeShade="80"/>
-                <w:sz w:val="24"/>
-                <w:szCs w:val="24"/>
+                <w:color w:val="262626"/>
+                <w:sz w:val="22"/>
               </w:rPr>
-            </w:pPr>
-          </w:p>
-          <w:p>
-            <w:pPr>
-              <w:jc w:val="both"/>
-              <w:rPr>
-                <w:rFonts w:eastAsiaTheme="majorEastAsia"/>
-                <w:color w:val="767171" w:themeColor="background2" w:themeShade="80"/>
-                <w:sz w:val="24"/>
-                <w:szCs w:val="24"/>
-              </w:rPr>
-            </w:pPr>
-          </w:p>
-          <w:p>
-            <w:pPr>
-              <w:jc w:val="both"/>
-              <w:rPr>
-                <w:rFonts w:eastAsiaTheme="majorEastAsia"/>
-                <w:color w:val="767171" w:themeColor="background2" w:themeShade="80"/>
-                <w:sz w:val="24"/>
-                <w:szCs w:val="24"/>
-              </w:rPr>
-            </w:pPr>
-          </w:p>
-          <w:p>
-            <w:pPr>
-              <w:jc w:val="both"/>
-              <w:rPr>
-                <w:rFonts w:ascii="Calibri" w:hAnsi="Calibri"/>
-                <w:b/>
-                <w:bCs/>
-                <w:color w:val="1F4E79" w:themeColor="accent1" w:themeShade="80"/>
-              </w:rPr>
-            </w:pPr>
+              <w:t>Como aspecto positivo, trabajar solo me ha obligado a entender cada capa del sistema, desde los sensores hasta el panel y la base de datos. Como aspecto a mejorar, debería buscar antes la opinión de usuarios potenciales, como cuidadores y profesionales de la salud, para validar el panel y las alertas, en lugar de esperar a la Fase 3.</w:t>
+            </w:r>
           </w:p>
         </w:tc>
       </w:tr>

</xml_diff>

<commit_message>
docs: Diario de Reflexión 2.1 actualizado con resultados de PR-02 y PR-03
</commit_message>
<xml_diff>
--- a/docs/fase2/evidencias_individuales/VERGARA_ANDRES_2.1_APT122_DiarioReflexionFase2.docx
+++ b/docs/fase2/evidencias_individuales/VERGARA_ANDRES_2.1_APT122_DiarioReflexionFase2.docx
@@ -343,7 +343,7 @@
                 <w:color w:val="262626"/>
                 <w:sz w:val="22"/>
               </w:rPr>
-              <w:t>Quedaron pendientes el conteo de entregas de ntfy, la prueba de continuidad sin conexión, la autenticación de la API, el recurso FHIR Patient y el despliegue en Oracle Cloud Santiago.</w:t>
+              <w:t>Dos de las actividades que tenía pendientes ya las completé en el Sprint 4: la prueba de entrega de notificaciones ntfy, en la que llegaron 30 de 30 avisos al celular (100 %), y la prueba de continuidad sin conexión, en la que el sistema guardó y mostró en el panel local 10 de 10 caídas sin internet. Esta última prueba además me mostró algo que no tenía previsto: al volver la conexión, los datos guardados localmente no se sincronizan con la nube. Siguen pendientes la autenticación de la API, el recurso FHIR Patient y el despliegue en Oracle Cloud Santiago.</w:t>
             </w:r>
           </w:p>
           <w:p>
@@ -487,7 +487,7 @@
                 <w:color w:val="262626"/>
                 <w:sz w:val="22"/>
               </w:rPr>
-              <w:t>Para el problema de tiempo, organizo el trabajo en bloques de pocas horas con una lista de tareas por bloque, y hago commit al final de cada uno para no perder avances. Además, envío avances al docente por correo cuando no puedo asistir a clases. Para lo que viene, planeo desplegar en Oracle Cloud Santiago para reducir la latencia y ejecutar las pruebas pendientes antes de la segunda evaluación de la Fase 2.</w:t>
+              <w:t>Para el problema de tiempo, organizo el trabajo en bloques de pocas horas con una lista de tareas por bloque, y hago commit al final de cada uno para no perder avances. Además, envío avances al docente por correo cuando no puedo asistir a clases. Para lo que viene, planeo desplegar en Oracle Cloud Santiago para reducir la latencia, implementar la sincronización de los datos guardados sin conexión y completar la autenticación de la API antes de la segunda evaluación de la Fase 2.</w:t>
             </w:r>
           </w:p>
         </w:tc>
@@ -1009,7 +1009,7 @@
                 <w:color w:val="262626"/>
                 <w:sz w:val="22"/>
               </w:rPr>
-              <w:t>Sí hay nuevas actividades que incorporé al Product Backlog a partir de este monitoreo: el conteo de entregas de ntfy con 30 caídas, la prueba de continuidad sin conexión, la autenticación de la API (PS-01), el recurso FHIR Patient, el despliegue en Oracle Cloud Santiago y algunos ajustes del panel (estados simulados de Raspberry y MQTT, estilo de alertas atendidas y la regla de apertura de puerta). Las ordené por prioridad para abordarlas antes de la segunda evaluación.</w:t>
+              <w:t>Sí hay nuevas actividades que incorporé al Product Backlog a partir de este monitoreo. Ya completé el conteo de entregas de ntfy (30/30) y la prueba de continuidad sin conexión (10/10). Quedan la autenticación de la API (PS-01), el recurso FHIR Patient, el despliegue en Oracle Cloud Santiago, la sincronización de los datos guardados sin conexión y algunos ajustes del panel (estados simulados de Raspberry y MQTT, estilo de alertas atendidas, la base de datos que muestra el panel y la regla de apertura de puerta). Las ordené por prioridad para abordarlas antes de la segunda evaluación.</w:t>
             </w:r>
           </w:p>
         </w:tc>

</xml_diff>